<commit_message>
Make partner intro more persuasive and show stronger commitment
Co-Authored-By: Claude Opus 5.5 (1M context) <noreply@anthropic.com>
</commit_message>
<xml_diff>
--- a/partner-intro/사업파트너_소개서_수정본.docx
+++ b/partner-intro/사업파트너_소개서_수정본.docx
@@ -3090,7 +3090,7 @@
                 <w:sz w:val="19"/>
                 <w:szCs w:val="19"/>
               </w:rPr>
-              <w:t xml:space="preserve">숫자와 지표에 근거한 가치투자자입니다. 퀀트 자동화 툴을 직접 만들다 한계를 느끼던 중 QT-4를 만났고, '내가 만들고 싶던 것이 이미 여기 있다'고 확신했습니다. 이 시스템을 만든 팀과 함께 사업을 키우고 싶습니다.</w:t>
+              <w:t xml:space="preserve">숫자와 지표로 가치투자를 해 왔고, 퀀트 자동화 툴을 혼자 만들어 보려다 번번이 벽에 부딪혔습니다. 그러다 QT-4를 만났고, 신세계를 보는 느낌이었습니다. 제가 만들고 싶던 것이 이미 여기 있었습니다. 이 시스템을 만든 팀과 함께 사업을 키우는 일, 지금 제가 가장 하고 싶은 일입니다.</w:t>
             </w:r>
           </w:p>
           <w:p>
@@ -3125,7 +3125,7 @@
                 <w:sz w:val="19"/>
                 <w:szCs w:val="19"/>
               </w:rPr>
-              <w:t xml:space="preserve">1) 기술 – 개발 보조·디버깅, 데이터 파이프라인(n8n·크롤링·DART) 구축</w:t>
+              <w:t xml:space="preserve">1) 기술 – 개발 보조·디버깅, 데이터 파이프라인(n8n·크롤링·DART) 구축 — 지금도 직접 운영 중인 일</w:t>
             </w:r>
           </w:p>
           <w:p>
@@ -3153,7 +3153,7 @@
                 <w:sz w:val="19"/>
                 <w:szCs w:val="19"/>
               </w:rPr>
-              <w:t xml:space="preserve">3) 네트워크 – 부산·경상권 투자자 커넥션을 통한 고객 발굴 및 투자 유치 연결</w:t>
+              <w:t xml:space="preserve">3) 네트워크 – 부산·경상권 투자자 커넥션으로 첫 고객 발굴과 투자 유치 연결</w:t>
             </w:r>
           </w:p>
           <w:p>
@@ -3172,7 +3172,7 @@
                 <w:sz w:val="19"/>
                 <w:szCs w:val="19"/>
               </w:rPr>
-              <w:t xml:space="preserve">투자 모임이 무엇을 불편해하고 어디가 비어 있는지 안에서 직접 보아 왔습니다. 그 빈자리가 곧 이 시스템의 시장입니다.</w:t>
+              <w:t xml:space="preserve">투자 모임이 무엇을 불편해하고 어디가 비어 있는지 안에서 직접 보아 왔습니다. 그 빈자리가 이 시스템의 첫 시장이고, 그 시장의 문을 제가 열 수 있습니다.</w:t>
             </w:r>
           </w:p>
         </w:tc>
@@ -3328,7 +3328,7 @@
                 <w:sz w:val="19"/>
                 <w:szCs w:val="19"/>
               </w:rPr>
-              <w:t xml:space="preserve">여기에 15년간 원전 안전관리자로 일하며 몸에 밴 '규정 준수와 리스크 관리' 습관은, 실제 돈이 움직이는 자동매매 시스템을 안정적으로 운영하는 데 그대로 쓰일 수 있습니다.</w:t>
+              <w:t xml:space="preserve">그리고 15년간 '작은 실수 하나가 큰 사고가 되는' 원전 현장에서 안전관리자로 일했습니다. 규정을 지키고 위험을 먼저 찾아내는 습관은, 실제 돈이 움직이는 자동매매 시스템에 가장 필요한 자질이라고 믿습니다.</w:t>
             </w:r>
           </w:p>
         </w:tc>
@@ -3424,7 +3424,7 @@
                 <w:sz w:val="19"/>
                 <w:szCs w:val="19"/>
               </w:rPr>
-              <w:t xml:space="preserve">규칙이 있을 때는 이겼고, 규칙이 없는 순간 감정이 모든 것을 망쳤습니다. 이 경험이 저를 '감정이 아닌 숫자와 시스템'으로 투자하는 길로 이끌었고, 제가 QT-4에 끌린 이유이기도 합니다.</w:t>
+              <w:t xml:space="preserve">규칙이 있을 때는 이겼고, 규칙이 없는 순간 감정이 모든 것을 망쳤습니다. 이 경험이 저를 '감정이 아닌 숫자와 시스템'으로 투자하는 길로 이끌었습니다. 제가 QT-4에 끌린 이유이고, 이 시스템이 더 많은 투자자에게 닿아야 한다고 믿는 이유입니다.</w:t>
             </w:r>
           </w:p>
         </w:tc>
@@ -3535,7 +3535,7 @@
                 <w:sz w:val="19"/>
                 <w:szCs w:val="19"/>
               </w:rPr>
-              <w:t xml:space="preserve">• 투자 – 일부 직접 투자 의향 있음, 필요 시 부산·경상권 투자자 연결 가능</w:t>
+              <w:t xml:space="preserve">• 투자 – 제 돈도 함께 넣겠습니다(일부 직접 투자). 필요 시 부산·경상권 투자자 연결 가능</w:t>
             </w:r>
           </w:p>
           <w:p>
@@ -3549,7 +3549,28 @@
                 <w:sz w:val="19"/>
                 <w:szCs w:val="19"/>
               </w:rPr>
-              <w:t xml:space="preserve">• 근무 – 교대근무와 병행, 비번일 중심으로 시간 확보</w:t>
+              <w:t xml:space="preserve">• 근무 – 교대근무와 병행하되, 비번일은 온전히 이 사업에 쓰겠습니다</w:t>
+            </w:r>
+          </w:p>
+          <w:p>
+            <w:pPr>
+              <w:spacing w:after="0" w:before="0" w:line="120"/>
+            </w:pPr>
+          </w:p>
+          <w:p>
+            <w:pPr>
+              <w:spacing w:after="0" w:before="0" w:line="264"/>
+            </w:pPr>
+            <w:r>
+              <w:rPr>
+                <w:rFonts w:ascii="맑은 고딕" w:cs="맑은 고딕" w:eastAsia="맑은 고딕" w:hAnsi="맑은 고딕"/>
+                <w:b/>
+                <w:bCs/>
+                <w:color w:val="1B2130"/>
+                <w:sz w:val="19"/>
+                <w:szCs w:val="19"/>
+              </w:rPr>
+              <w:t xml:space="preserve">이름만 올리는 파트너가 아니라, 시간과 돈을 함께 걸고 결과로 증명하는 파트너가 되겠습니다. 꼭 함께하고 싶습니다.</w:t>
             </w:r>
           </w:p>
         </w:tc>

</xml_diff>